<commit_message>
Corriger la portée des styles et relations DOCX
</commit_message>
<xml_diff>
--- a/tests/fixtures/docx/native-editorial.docx
+++ b/tests/fixtures/docx/native-editorial.docx
@@ -176,7 +176,7 @@
 </file>
 
 <file path=word/endnotes.xml><?xml version="1.0" encoding="utf-8"?>
-<w:endnotes xmlns:w="http://schemas.openxmlformats.org/wordprocessingml/2006/main">
+<w:endnotes xmlns:w="http://schemas.openxmlformats.org/wordprocessingml/2006/main" xmlns:r="http://schemas.openxmlformats.org/officeDocument/2006/relationships">
   <w:endnote w:id="-1" w:type="separator">
     <w:p>
       <w:r>
@@ -187,15 +187,20 @@
   <w:endnote w:id="20">
     <w:p>
       <w:r>
-        <w:t>Note de fin</w:t>
-      </w:r>
+        <w:t>Note de fin </w:t>
+      </w:r>
+      <w:hyperlink r:id="rIdHyper">
+        <w:r>
+          <w:t>lien fin</w:t>
+        </w:r>
+      </w:hyperlink>
     </w:p>
   </w:endnote>
 </w:endnotes>
 </file>
 
 <file path=word/footnotes.xml><?xml version="1.0" encoding="utf-8"?>
-<w:footnotes xmlns:w="http://schemas.openxmlformats.org/wordprocessingml/2006/main">
+<w:footnotes xmlns:w="http://schemas.openxmlformats.org/wordprocessingml/2006/main" xmlns:r="http://schemas.openxmlformats.org/officeDocument/2006/relationships">
   <w:footnote w:id="-1" w:type="separator">
     <w:p>
       <w:r>
@@ -213,8 +218,13 @@
       </w:r>
       <w:r>
         <w:br/>
-        <w:t> suite</w:t>
-      </w:r>
+        <w:t> suite </w:t>
+      </w:r>
+      <w:hyperlink r:id="rIdHyper">
+        <w:r>
+          <w:t>lien note</w:t>
+        </w:r>
+      </w:hyperlink>
     </w:p>
   </w:footnote>
   <w:footnote w:id="99">
@@ -242,11 +252,14 @@
 <w:styles xmlns:w="http://schemas.openxmlformats.org/wordprocessingml/2006/main">
   <w:style w:type="paragraph" w:default="1" w:styleId="Normal">
     <w:name w:val="Normal"/>
+    <w:pPr>
+      <w:outlineLvl w:val="0"/>
+    </w:pPr>
   </w:style>
   <w:style w:type="paragraph" w:styleId="Heading1">
     <w:name w:val="Titre 1 localise"/>
     <w:pPr>
-      <w:outlineLvl w:val="0"/>
+      <w:outlineLvl w:val="4"/>
     </w:pPr>
   </w:style>
   <w:style w:type="paragraph" w:styleId="Heading2">
@@ -263,18 +276,27 @@
   </w:style>
   <w:style w:type="paragraph" w:styleId="Title">
     <w:name w:val="Titre bibliographique"/>
+    <w:pPr>
+      <w:outlineLvl w:val="0"/>
+    </w:pPr>
   </w:style>
   <w:style w:type="paragraph" w:styleId="Subtitle">
     <w:name w:val="Sous-titre bibliographique"/>
   </w:style>
   <w:style w:type="paragraph" w:styleId="Quote">
     <w:name w:val="Citation"/>
+    <w:pPr>
+      <w:outlineLvl w:val="1"/>
+    </w:pPr>
   </w:style>
   <w:style w:type="paragraph" w:styleId="IntenseQuote">
     <w:name w:val="Citation intense"/>
   </w:style>
   <w:style w:type="paragraph" w:styleId="UnknownParagraph">
     <w:name w:val="Style local inconnu"/>
+    <w:pPr>
+      <w:outlineLvl w:val="2"/>
+    </w:pPr>
   </w:style>
   <w:style w:type="character" w:styleId="Emphasis">
     <w:name w:val="Mise en evidence"/>

</xml_diff>